<commit_message>
Updated with Graduate Outreach Ambassador
</commit_message>
<xml_diff>
--- a/Resume_Hollis_A_Schuler.docx
+++ b/Resume_Hollis_A_Schuler.docx
@@ -55,7 +55,15 @@
           <w:sz w:val="20"/>
           <w:szCs w:val="20"/>
         </w:rPr>
-        <w:t xml:space="preserve">) </w:t>
+        <w:t>)</w:t>
+      </w:r>
+      <w:r>
+        <w:rPr>
+          <w:rFonts w:ascii="Times New Roman" w:hAnsi="Times New Roman" w:cs="Times New Roman"/>
+          <w:sz w:val="20"/>
+          <w:szCs w:val="20"/>
+        </w:rPr>
+        <w:t>-</w:t>
       </w:r>
       <w:r>
         <w:rPr>
@@ -98,11 +106,9 @@
         <w:t xml:space="preserve">| </w:t>
       </w:r>
       <w:hyperlink r:id="rId10" w:history="1">
-        <w:proofErr w:type="spellStart"/>
         <w:r>
           <w:t>Alex.Schuler@colorado.edu</w:t>
         </w:r>
-        <w:proofErr w:type="spellEnd"/>
       </w:hyperlink>
     </w:p>
     <w:p>
@@ -186,7 +192,37 @@
           <w:sz w:val="20"/>
           <w:szCs w:val="20"/>
         </w:rPr>
-        <w:t>Columbus, OH</w:t>
+        <w:t xml:space="preserve">   </w:t>
+      </w:r>
+      <w:r>
+        <w:rPr>
+          <w:rFonts w:ascii="Times New Roman" w:hAnsi="Times New Roman" w:cs="Times New Roman"/>
+          <w:b/>
+          <w:bCs/>
+          <w:sz w:val="20"/>
+          <w:szCs w:val="20"/>
+        </w:rPr>
+        <w:t>Boulder</w:t>
+      </w:r>
+      <w:r>
+        <w:rPr>
+          <w:rFonts w:ascii="Times New Roman" w:hAnsi="Times New Roman" w:cs="Times New Roman"/>
+          <w:b/>
+          <w:bCs/>
+          <w:sz w:val="20"/>
+          <w:szCs w:val="20"/>
+        </w:rPr>
+        <w:t xml:space="preserve">, </w:t>
+      </w:r>
+      <w:r>
+        <w:rPr>
+          <w:rFonts w:ascii="Times New Roman" w:hAnsi="Times New Roman" w:cs="Times New Roman"/>
+          <w:b/>
+          <w:bCs/>
+          <w:sz w:val="20"/>
+          <w:szCs w:val="20"/>
+        </w:rPr>
+        <w:t>CO</w:t>
       </w:r>
     </w:p>
     <w:p>
@@ -672,7 +708,39 @@
           <w:sz w:val="20"/>
           <w:szCs w:val="20"/>
         </w:rPr>
-        <w:t xml:space="preserve"> Laude, and was a </w:t>
+        <w:t xml:space="preserve"> Laude,</w:t>
+      </w:r>
+      <w:r>
+        <w:rPr>
+          <w:rFonts w:ascii="Times New Roman" w:hAnsi="Times New Roman" w:cs="Times New Roman"/>
+          <w:sz w:val="20"/>
+          <w:szCs w:val="20"/>
+        </w:rPr>
+        <w:t xml:space="preserve"> was</w:t>
+      </w:r>
+      <w:r>
+        <w:rPr>
+          <w:rFonts w:ascii="Times New Roman" w:hAnsi="Times New Roman" w:cs="Times New Roman"/>
+          <w:sz w:val="20"/>
+          <w:szCs w:val="20"/>
+        </w:rPr>
+        <w:t xml:space="preserve"> </w:t>
+      </w:r>
+      <w:r>
+        <w:rPr>
+          <w:rFonts w:ascii="Times New Roman" w:hAnsi="Times New Roman" w:cs="Times New Roman"/>
+          <w:sz w:val="20"/>
+          <w:szCs w:val="20"/>
+        </w:rPr>
+        <w:t xml:space="preserve">named </w:t>
+      </w:r>
+      <w:r>
+        <w:rPr>
+          <w:rFonts w:ascii="Times New Roman" w:hAnsi="Times New Roman" w:cs="Times New Roman"/>
+          <w:sz w:val="20"/>
+          <w:szCs w:val="20"/>
+        </w:rPr>
+        <w:t xml:space="preserve">a </w:t>
       </w:r>
       <w:r>
         <w:rPr>
@@ -871,28 +939,16 @@
         </w:rPr>
         <w:tab/>
       </w:r>
-      <w:proofErr w:type="gramStart"/>
-      <w:r>
-        <w:rPr>
-          <w:rFonts w:ascii="Times New Roman" w:hAnsi="Times New Roman" w:cs="Times New Roman"/>
-          <w:b/>
-          <w:bCs/>
-          <w:sz w:val="20"/>
-          <w:szCs w:val="20"/>
-        </w:rPr>
-        <w:tab/>
-        <w:t xml:space="preserve">  Columbus</w:t>
-      </w:r>
-      <w:proofErr w:type="gramEnd"/>
-      <w:r>
-        <w:rPr>
-          <w:rFonts w:ascii="Times New Roman" w:hAnsi="Times New Roman" w:cs="Times New Roman"/>
-          <w:b/>
-          <w:bCs/>
-          <w:sz w:val="20"/>
-          <w:szCs w:val="20"/>
-        </w:rPr>
-        <w:t>, OH</w:t>
+      <w:r>
+        <w:rPr>
+          <w:rFonts w:ascii="Times New Roman" w:hAnsi="Times New Roman" w:cs="Times New Roman"/>
+          <w:b/>
+          <w:bCs/>
+          <w:sz w:val="20"/>
+          <w:szCs w:val="20"/>
+        </w:rPr>
+        <w:tab/>
+        <w:t xml:space="preserve">  Columbus, OH</w:t>
       </w:r>
     </w:p>
     <w:p>
@@ -1064,33 +1120,15 @@
           <w:sz w:val="20"/>
           <w:szCs w:val="20"/>
         </w:rPr>
-        <w:t xml:space="preserve"> </w:t>
-      </w:r>
-      <w:proofErr w:type="gramStart"/>
-      <w:r>
-        <w:rPr>
-          <w:rFonts w:ascii="Times New Roman" w:hAnsi="Times New Roman" w:cs="Times New Roman"/>
-          <w:sz w:val="20"/>
-          <w:szCs w:val="20"/>
-        </w:rPr>
-        <w:t>a</w:t>
-      </w:r>
-      <w:r>
-        <w:rPr>
-          <w:rFonts w:ascii="Times New Roman" w:hAnsi="Times New Roman" w:cs="Times New Roman"/>
-          <w:sz w:val="20"/>
-          <w:szCs w:val="20"/>
-        </w:rPr>
-        <w:t xml:space="preserve"> software</w:t>
-      </w:r>
-      <w:proofErr w:type="gramEnd"/>
-      <w:r>
-        <w:rPr>
-          <w:rFonts w:ascii="Times New Roman" w:hAnsi="Times New Roman" w:cs="Times New Roman"/>
-          <w:sz w:val="20"/>
-          <w:szCs w:val="20"/>
-        </w:rPr>
-        <w:t xml:space="preserve"> architecture </w:t>
+        <w:t xml:space="preserve"> a</w:t>
+      </w:r>
+      <w:r>
+        <w:rPr>
+          <w:rFonts w:ascii="Times New Roman" w:hAnsi="Times New Roman" w:cs="Times New Roman"/>
+          <w:sz w:val="20"/>
+          <w:szCs w:val="20"/>
+        </w:rPr>
+        <w:t xml:space="preserve"> software architecture </w:t>
       </w:r>
       <w:r>
         <w:rPr>
@@ -2010,7 +2048,7 @@
           <w:sz w:val="20"/>
           <w:szCs w:val="20"/>
         </w:rPr>
-        <w:t>The Ohio State Underwater Robotics Team</w:t>
+        <w:t>Graduate Robotics Outreach Ambassador</w:t>
       </w:r>
       <w:r>
         <w:rPr>
@@ -2083,7 +2121,34 @@
           <w:szCs w:val="20"/>
         </w:rPr>
         <w:tab/>
-        <w:t xml:space="preserve">   Columbus, OH</w:t>
+        <w:t xml:space="preserve">   </w:t>
+      </w:r>
+      <w:r>
+        <w:rPr>
+          <w:rFonts w:ascii="Times New Roman" w:hAnsi="Times New Roman" w:cs="Times New Roman"/>
+          <w:b/>
+          <w:sz w:val="20"/>
+          <w:szCs w:val="20"/>
+        </w:rPr>
+        <w:t xml:space="preserve">   Boulder</w:t>
+      </w:r>
+      <w:r>
+        <w:rPr>
+          <w:rFonts w:ascii="Times New Roman" w:hAnsi="Times New Roman" w:cs="Times New Roman"/>
+          <w:b/>
+          <w:sz w:val="20"/>
+          <w:szCs w:val="20"/>
+        </w:rPr>
+        <w:t xml:space="preserve">, </w:t>
+      </w:r>
+      <w:r>
+        <w:rPr>
+          <w:rFonts w:ascii="Times New Roman" w:hAnsi="Times New Roman" w:cs="Times New Roman"/>
+          <w:b/>
+          <w:sz w:val="20"/>
+          <w:szCs w:val="20"/>
+        </w:rPr>
+        <w:t>CO</w:t>
       </w:r>
       <w:r>
         <w:rPr>
@@ -2113,118 +2178,138 @@
           <w:sz w:val="20"/>
           <w:szCs w:val="20"/>
         </w:rPr>
-        <w:t>President</w:t>
-      </w:r>
-      <w:r>
-        <w:rPr>
-          <w:rFonts w:ascii="Times New Roman" w:hAnsi="Times New Roman" w:cs="Times New Roman"/>
-          <w:i/>
-          <w:iCs/>
-          <w:sz w:val="20"/>
-          <w:szCs w:val="20"/>
-        </w:rPr>
-        <w:tab/>
-      </w:r>
-      <w:r>
-        <w:rPr>
-          <w:rFonts w:ascii="Times New Roman" w:hAnsi="Times New Roman" w:cs="Times New Roman"/>
-          <w:i/>
-          <w:iCs/>
-          <w:sz w:val="20"/>
-          <w:szCs w:val="20"/>
-        </w:rPr>
-        <w:tab/>
-      </w:r>
-      <w:r>
-        <w:rPr>
-          <w:rFonts w:ascii="Times New Roman" w:hAnsi="Times New Roman" w:cs="Times New Roman"/>
-          <w:i/>
-          <w:iCs/>
-          <w:sz w:val="20"/>
-          <w:szCs w:val="20"/>
-        </w:rPr>
-        <w:tab/>
-      </w:r>
-      <w:r>
-        <w:rPr>
-          <w:rFonts w:ascii="Times New Roman" w:hAnsi="Times New Roman" w:cs="Times New Roman"/>
-          <w:i/>
-          <w:iCs/>
-          <w:sz w:val="20"/>
-          <w:szCs w:val="20"/>
-        </w:rPr>
-        <w:tab/>
-      </w:r>
-      <w:r>
-        <w:rPr>
-          <w:rFonts w:ascii="Times New Roman" w:hAnsi="Times New Roman" w:cs="Times New Roman"/>
-          <w:i/>
-          <w:iCs/>
-          <w:sz w:val="20"/>
-          <w:szCs w:val="20"/>
-        </w:rPr>
-        <w:tab/>
-      </w:r>
-      <w:r>
-        <w:rPr>
-          <w:rFonts w:ascii="Times New Roman" w:hAnsi="Times New Roman" w:cs="Times New Roman"/>
-          <w:i/>
-          <w:iCs/>
-          <w:sz w:val="20"/>
-          <w:szCs w:val="20"/>
-        </w:rPr>
-        <w:tab/>
-      </w:r>
-      <w:r>
-        <w:rPr>
-          <w:rFonts w:ascii="Times New Roman" w:hAnsi="Times New Roman" w:cs="Times New Roman"/>
-          <w:i/>
-          <w:iCs/>
-          <w:sz w:val="20"/>
-          <w:szCs w:val="20"/>
-        </w:rPr>
-        <w:tab/>
-      </w:r>
-      <w:r>
-        <w:rPr>
-          <w:rFonts w:ascii="Times New Roman" w:hAnsi="Times New Roman" w:cs="Times New Roman"/>
-          <w:i/>
-          <w:iCs/>
-          <w:sz w:val="20"/>
-          <w:szCs w:val="20"/>
-        </w:rPr>
-        <w:tab/>
-      </w:r>
-      <w:r>
-        <w:rPr>
-          <w:rFonts w:ascii="Times New Roman" w:hAnsi="Times New Roman" w:cs="Times New Roman"/>
-          <w:i/>
-          <w:iCs/>
-          <w:sz w:val="20"/>
-          <w:szCs w:val="20"/>
-        </w:rPr>
-        <w:tab/>
-      </w:r>
-      <w:r>
-        <w:rPr>
-          <w:rFonts w:ascii="Times New Roman" w:hAnsi="Times New Roman" w:cs="Times New Roman"/>
-          <w:i/>
-          <w:iCs/>
-          <w:sz w:val="20"/>
-          <w:szCs w:val="20"/>
-        </w:rPr>
-        <w:tab/>
-        <w:t xml:space="preserve">        May 202</w:t>
-      </w:r>
-      <w:r>
-        <w:rPr>
-          <w:rFonts w:ascii="Times New Roman" w:hAnsi="Times New Roman" w:cs="Times New Roman"/>
-          <w:i/>
-          <w:iCs/>
-          <w:sz w:val="20"/>
-          <w:szCs w:val="20"/>
-        </w:rPr>
-        <w:t>4</w:t>
+        <w:t>Lab</w:t>
+      </w:r>
+      <w:r>
+        <w:rPr>
+          <w:rFonts w:ascii="Times New Roman" w:hAnsi="Times New Roman" w:cs="Times New Roman"/>
+          <w:i/>
+          <w:iCs/>
+          <w:sz w:val="20"/>
+          <w:szCs w:val="20"/>
+        </w:rPr>
+        <w:t xml:space="preserve"> Tour Working Group</w:t>
+      </w:r>
+      <w:r>
+        <w:rPr>
+          <w:rFonts w:ascii="Times New Roman" w:hAnsi="Times New Roman" w:cs="Times New Roman"/>
+          <w:i/>
+          <w:iCs/>
+          <w:sz w:val="20"/>
+          <w:szCs w:val="20"/>
+        </w:rPr>
+        <w:tab/>
+      </w:r>
+      <w:r>
+        <w:rPr>
+          <w:rFonts w:ascii="Times New Roman" w:hAnsi="Times New Roman" w:cs="Times New Roman"/>
+          <w:i/>
+          <w:iCs/>
+          <w:sz w:val="20"/>
+          <w:szCs w:val="20"/>
+        </w:rPr>
+        <w:tab/>
+      </w:r>
+      <w:r>
+        <w:rPr>
+          <w:rFonts w:ascii="Times New Roman" w:hAnsi="Times New Roman" w:cs="Times New Roman"/>
+          <w:i/>
+          <w:iCs/>
+          <w:sz w:val="20"/>
+          <w:szCs w:val="20"/>
+        </w:rPr>
+        <w:tab/>
+      </w:r>
+      <w:r>
+        <w:rPr>
+          <w:rFonts w:ascii="Times New Roman" w:hAnsi="Times New Roman" w:cs="Times New Roman"/>
+          <w:i/>
+          <w:iCs/>
+          <w:sz w:val="20"/>
+          <w:szCs w:val="20"/>
+        </w:rPr>
+        <w:tab/>
+      </w:r>
+      <w:r>
+        <w:rPr>
+          <w:rFonts w:ascii="Times New Roman" w:hAnsi="Times New Roman" w:cs="Times New Roman"/>
+          <w:i/>
+          <w:iCs/>
+          <w:sz w:val="20"/>
+          <w:szCs w:val="20"/>
+        </w:rPr>
+        <w:tab/>
+      </w:r>
+      <w:r>
+        <w:rPr>
+          <w:rFonts w:ascii="Times New Roman" w:hAnsi="Times New Roman" w:cs="Times New Roman"/>
+          <w:i/>
+          <w:iCs/>
+          <w:sz w:val="20"/>
+          <w:szCs w:val="20"/>
+        </w:rPr>
+        <w:tab/>
+      </w:r>
+      <w:r>
+        <w:rPr>
+          <w:rFonts w:ascii="Times New Roman" w:hAnsi="Times New Roman" w:cs="Times New Roman"/>
+          <w:i/>
+          <w:iCs/>
+          <w:sz w:val="20"/>
+          <w:szCs w:val="20"/>
+        </w:rPr>
+        <w:tab/>
+      </w:r>
+      <w:r>
+        <w:rPr>
+          <w:rFonts w:ascii="Times New Roman" w:hAnsi="Times New Roman" w:cs="Times New Roman"/>
+          <w:i/>
+          <w:iCs/>
+          <w:sz w:val="20"/>
+          <w:szCs w:val="20"/>
+        </w:rPr>
+        <w:tab/>
+      </w:r>
+      <w:r>
+        <w:rPr>
+          <w:rFonts w:ascii="Times New Roman" w:hAnsi="Times New Roman" w:cs="Times New Roman"/>
+          <w:i/>
+          <w:iCs/>
+          <w:sz w:val="20"/>
+          <w:szCs w:val="20"/>
+        </w:rPr>
+        <w:tab/>
+        <w:t xml:space="preserve"> </w:t>
+      </w:r>
+      <w:r>
+        <w:rPr>
+          <w:rFonts w:ascii="Times New Roman" w:hAnsi="Times New Roman" w:cs="Times New Roman"/>
+          <w:i/>
+          <w:iCs/>
+          <w:sz w:val="20"/>
+          <w:szCs w:val="20"/>
+        </w:rPr>
+        <w:t>September</w:t>
+      </w:r>
+      <w:r>
+        <w:rPr>
+          <w:rFonts w:ascii="Times New Roman" w:hAnsi="Times New Roman" w:cs="Times New Roman"/>
+          <w:i/>
+          <w:iCs/>
+          <w:sz w:val="20"/>
+          <w:szCs w:val="20"/>
+        </w:rPr>
+        <w:t xml:space="preserve"> 20</w:t>
+      </w:r>
+      <w:r>
+        <w:rPr>
+          <w:rFonts w:ascii="Times New Roman" w:hAnsi="Times New Roman" w:cs="Times New Roman"/>
+          <w:i/>
+          <w:iCs/>
+          <w:sz w:val="20"/>
+          <w:szCs w:val="20"/>
+        </w:rPr>
+        <w:t>25</w:t>
       </w:r>
       <w:r>
         <w:rPr>
@@ -2244,7 +2329,7 @@
           <w:sz w:val="20"/>
           <w:szCs w:val="20"/>
         </w:rPr>
-        <w:t>May 2025</w:t>
+        <w:t xml:space="preserve"> Present</w:t>
       </w:r>
     </w:p>
     <w:p>
@@ -2268,39 +2353,39 @@
           <w:sz w:val="20"/>
           <w:szCs w:val="20"/>
         </w:rPr>
-        <w:t>Manag</w:t>
-      </w:r>
-      <w:r>
-        <w:rPr>
-          <w:rFonts w:ascii="Times New Roman" w:hAnsi="Times New Roman" w:cs="Times New Roman"/>
-          <w:sz w:val="20"/>
-          <w:szCs w:val="20"/>
-        </w:rPr>
-        <w:t>ed</w:t>
-      </w:r>
-      <w:r>
-        <w:rPr>
-          <w:rFonts w:ascii="Times New Roman" w:hAnsi="Times New Roman" w:cs="Times New Roman"/>
-          <w:sz w:val="20"/>
-          <w:szCs w:val="20"/>
-        </w:rPr>
-        <w:t xml:space="preserve"> day-to-day operations of the student organization including recruitment</w:t>
-      </w:r>
-      <w:r>
-        <w:rPr>
-          <w:rFonts w:ascii="Times New Roman" w:hAnsi="Times New Roman" w:cs="Times New Roman"/>
-          <w:sz w:val="20"/>
-          <w:szCs w:val="20"/>
-        </w:rPr>
-        <w:t>, finance</w:t>
-      </w:r>
-      <w:r>
-        <w:rPr>
-          <w:rFonts w:ascii="Times New Roman" w:hAnsi="Times New Roman" w:cs="Times New Roman"/>
-          <w:sz w:val="20"/>
-          <w:szCs w:val="20"/>
-        </w:rPr>
-        <w:t xml:space="preserve"> and</w:t>
+        <w:t>Working</w:t>
+      </w:r>
+      <w:r>
+        <w:rPr>
+          <w:rFonts w:ascii="Times New Roman" w:hAnsi="Times New Roman" w:cs="Times New Roman"/>
+          <w:sz w:val="20"/>
+          <w:szCs w:val="20"/>
+        </w:rPr>
+        <w:t xml:space="preserve"> with faculty and fellow graduate students</w:t>
+      </w:r>
+      <w:r>
+        <w:rPr>
+          <w:rFonts w:ascii="Times New Roman" w:hAnsi="Times New Roman" w:cs="Times New Roman"/>
+          <w:sz w:val="20"/>
+          <w:szCs w:val="20"/>
+        </w:rPr>
+        <w:t xml:space="preserve"> to organize community tours of</w:t>
+      </w:r>
+      <w:r>
+        <w:rPr>
+          <w:rFonts w:ascii="Times New Roman" w:hAnsi="Times New Roman" w:cs="Times New Roman"/>
+          <w:sz w:val="20"/>
+          <w:szCs w:val="20"/>
+        </w:rPr>
+        <w:t xml:space="preserve"> university</w:t>
+      </w:r>
+      <w:r>
+        <w:rPr>
+          <w:rFonts w:ascii="Times New Roman" w:hAnsi="Times New Roman" w:cs="Times New Roman"/>
+          <w:sz w:val="20"/>
+          <w:szCs w:val="20"/>
+        </w:rPr>
+        <w:t xml:space="preserve"> robotics labs</w:t>
       </w:r>
       <w:r>
         <w:rPr>
@@ -2310,13 +2395,258 @@
         </w:rPr>
         <w:t xml:space="preserve"> </w:t>
       </w:r>
-      <w:r>
-        <w:rPr>
-          <w:rFonts w:ascii="Times New Roman" w:hAnsi="Times New Roman" w:cs="Times New Roman"/>
-          <w:sz w:val="20"/>
-          <w:szCs w:val="20"/>
-        </w:rPr>
-        <w:t>sponsor outreach</w:t>
+    </w:p>
+    <w:p>
+      <w:pPr>
+        <w:rPr>
+          <w:rFonts w:ascii="Times New Roman" w:hAnsi="Times New Roman" w:cs="Times New Roman"/>
+          <w:b/>
+          <w:sz w:val="20"/>
+          <w:szCs w:val="20"/>
+        </w:rPr>
+      </w:pPr>
+      <w:r>
+        <w:rPr>
+          <w:rFonts w:ascii="Times New Roman" w:hAnsi="Times New Roman" w:cs="Times New Roman"/>
+          <w:b/>
+          <w:sz w:val="20"/>
+          <w:szCs w:val="20"/>
+        </w:rPr>
+        <w:t>The Ohio State Underwater Robotics Team</w:t>
+      </w:r>
+      <w:r>
+        <w:rPr>
+          <w:rFonts w:ascii="Times New Roman" w:hAnsi="Times New Roman" w:cs="Times New Roman"/>
+          <w:b/>
+          <w:sz w:val="20"/>
+          <w:szCs w:val="20"/>
+        </w:rPr>
+        <w:tab/>
+      </w:r>
+      <w:r>
+        <w:rPr>
+          <w:rFonts w:ascii="Times New Roman" w:hAnsi="Times New Roman" w:cs="Times New Roman"/>
+          <w:b/>
+          <w:sz w:val="20"/>
+          <w:szCs w:val="20"/>
+        </w:rPr>
+        <w:tab/>
+      </w:r>
+      <w:r>
+        <w:rPr>
+          <w:rFonts w:ascii="Times New Roman" w:hAnsi="Times New Roman" w:cs="Times New Roman"/>
+          <w:b/>
+          <w:sz w:val="20"/>
+          <w:szCs w:val="20"/>
+        </w:rPr>
+        <w:t xml:space="preserve">        </w:t>
+      </w:r>
+      <w:r>
+        <w:rPr>
+          <w:rFonts w:ascii="Times New Roman" w:hAnsi="Times New Roman" w:cs="Times New Roman"/>
+          <w:b/>
+          <w:sz w:val="20"/>
+          <w:szCs w:val="20"/>
+        </w:rPr>
+        <w:tab/>
+      </w:r>
+      <w:r>
+        <w:rPr>
+          <w:rFonts w:ascii="Times New Roman" w:hAnsi="Times New Roman" w:cs="Times New Roman"/>
+          <w:b/>
+          <w:sz w:val="20"/>
+          <w:szCs w:val="20"/>
+        </w:rPr>
+        <w:tab/>
+      </w:r>
+      <w:r>
+        <w:rPr>
+          <w:rFonts w:ascii="Times New Roman" w:hAnsi="Times New Roman" w:cs="Times New Roman"/>
+          <w:b/>
+          <w:sz w:val="20"/>
+          <w:szCs w:val="20"/>
+        </w:rPr>
+        <w:tab/>
+      </w:r>
+      <w:r>
+        <w:rPr>
+          <w:rFonts w:ascii="Times New Roman" w:hAnsi="Times New Roman" w:cs="Times New Roman"/>
+          <w:b/>
+          <w:sz w:val="20"/>
+          <w:szCs w:val="20"/>
+        </w:rPr>
+        <w:tab/>
+      </w:r>
+      <w:r>
+        <w:rPr>
+          <w:rFonts w:ascii="Times New Roman" w:hAnsi="Times New Roman" w:cs="Times New Roman"/>
+          <w:b/>
+          <w:sz w:val="20"/>
+          <w:szCs w:val="20"/>
+        </w:rPr>
+        <w:tab/>
+        <w:t xml:space="preserve">   Columbus, OH</w:t>
+      </w:r>
+      <w:r>
+        <w:rPr>
+          <w:rFonts w:ascii="Times New Roman" w:hAnsi="Times New Roman" w:cs="Times New Roman"/>
+          <w:b/>
+          <w:sz w:val="20"/>
+          <w:szCs w:val="20"/>
+        </w:rPr>
+        <w:t xml:space="preserve"> </w:t>
+      </w:r>
+    </w:p>
+    <w:p>
+      <w:pPr>
+        <w:rPr>
+          <w:rFonts w:ascii="Times New Roman" w:hAnsi="Times New Roman" w:cs="Times New Roman"/>
+          <w:i/>
+          <w:iCs/>
+          <w:sz w:val="20"/>
+          <w:szCs w:val="20"/>
+        </w:rPr>
+      </w:pPr>
+      <w:r>
+        <w:rPr>
+          <w:rFonts w:ascii="Times New Roman" w:hAnsi="Times New Roman" w:cs="Times New Roman"/>
+          <w:i/>
+          <w:iCs/>
+          <w:sz w:val="20"/>
+          <w:szCs w:val="20"/>
+        </w:rPr>
+        <w:t>President</w:t>
+      </w:r>
+      <w:r>
+        <w:rPr>
+          <w:rFonts w:ascii="Times New Roman" w:hAnsi="Times New Roman" w:cs="Times New Roman"/>
+          <w:i/>
+          <w:iCs/>
+          <w:sz w:val="20"/>
+          <w:szCs w:val="20"/>
+        </w:rPr>
+        <w:tab/>
+      </w:r>
+      <w:r>
+        <w:rPr>
+          <w:rFonts w:ascii="Times New Roman" w:hAnsi="Times New Roman" w:cs="Times New Roman"/>
+          <w:i/>
+          <w:iCs/>
+          <w:sz w:val="20"/>
+          <w:szCs w:val="20"/>
+        </w:rPr>
+        <w:tab/>
+      </w:r>
+      <w:r>
+        <w:rPr>
+          <w:rFonts w:ascii="Times New Roman" w:hAnsi="Times New Roman" w:cs="Times New Roman"/>
+          <w:i/>
+          <w:iCs/>
+          <w:sz w:val="20"/>
+          <w:szCs w:val="20"/>
+        </w:rPr>
+        <w:tab/>
+      </w:r>
+      <w:r>
+        <w:rPr>
+          <w:rFonts w:ascii="Times New Roman" w:hAnsi="Times New Roman" w:cs="Times New Roman"/>
+          <w:i/>
+          <w:iCs/>
+          <w:sz w:val="20"/>
+          <w:szCs w:val="20"/>
+        </w:rPr>
+        <w:tab/>
+      </w:r>
+      <w:r>
+        <w:rPr>
+          <w:rFonts w:ascii="Times New Roman" w:hAnsi="Times New Roman" w:cs="Times New Roman"/>
+          <w:i/>
+          <w:iCs/>
+          <w:sz w:val="20"/>
+          <w:szCs w:val="20"/>
+        </w:rPr>
+        <w:tab/>
+      </w:r>
+      <w:r>
+        <w:rPr>
+          <w:rFonts w:ascii="Times New Roman" w:hAnsi="Times New Roman" w:cs="Times New Roman"/>
+          <w:i/>
+          <w:iCs/>
+          <w:sz w:val="20"/>
+          <w:szCs w:val="20"/>
+        </w:rPr>
+        <w:tab/>
+      </w:r>
+      <w:r>
+        <w:rPr>
+          <w:rFonts w:ascii="Times New Roman" w:hAnsi="Times New Roman" w:cs="Times New Roman"/>
+          <w:i/>
+          <w:iCs/>
+          <w:sz w:val="20"/>
+          <w:szCs w:val="20"/>
+        </w:rPr>
+        <w:tab/>
+      </w:r>
+      <w:r>
+        <w:rPr>
+          <w:rFonts w:ascii="Times New Roman" w:hAnsi="Times New Roman" w:cs="Times New Roman"/>
+          <w:i/>
+          <w:iCs/>
+          <w:sz w:val="20"/>
+          <w:szCs w:val="20"/>
+        </w:rPr>
+        <w:tab/>
+      </w:r>
+      <w:r>
+        <w:rPr>
+          <w:rFonts w:ascii="Times New Roman" w:hAnsi="Times New Roman" w:cs="Times New Roman"/>
+          <w:i/>
+          <w:iCs/>
+          <w:sz w:val="20"/>
+          <w:szCs w:val="20"/>
+        </w:rPr>
+        <w:tab/>
+      </w:r>
+      <w:r>
+        <w:rPr>
+          <w:rFonts w:ascii="Times New Roman" w:hAnsi="Times New Roman" w:cs="Times New Roman"/>
+          <w:i/>
+          <w:iCs/>
+          <w:sz w:val="20"/>
+          <w:szCs w:val="20"/>
+        </w:rPr>
+        <w:tab/>
+        <w:t xml:space="preserve">        May 202</w:t>
+      </w:r>
+      <w:r>
+        <w:rPr>
+          <w:rFonts w:ascii="Times New Roman" w:hAnsi="Times New Roman" w:cs="Times New Roman"/>
+          <w:i/>
+          <w:iCs/>
+          <w:sz w:val="20"/>
+          <w:szCs w:val="20"/>
+        </w:rPr>
+        <w:t>4</w:t>
+      </w:r>
+      <w:r>
+        <w:rPr>
+          <w:rFonts w:ascii="Times New Roman" w:hAnsi="Times New Roman" w:cs="Times New Roman"/>
+          <w:i/>
+          <w:iCs/>
+          <w:sz w:val="20"/>
+          <w:szCs w:val="20"/>
+        </w:rPr>
+        <w:t xml:space="preserve"> -</w:t>
+      </w:r>
+      <w:r>
+        <w:rPr>
+          <w:rFonts w:ascii="Times New Roman" w:hAnsi="Times New Roman" w:cs="Times New Roman"/>
+          <w:i/>
+          <w:iCs/>
+          <w:sz w:val="20"/>
+          <w:szCs w:val="20"/>
+        </w:rPr>
+        <w:t>May 2025</w:t>
       </w:r>
     </w:p>
     <w:p>
@@ -2328,105 +2658,67 @@
         </w:numPr>
         <w:rPr>
           <w:rFonts w:ascii="Times New Roman" w:hAnsi="Times New Roman" w:cs="Times New Roman"/>
-          <w:sz w:val="20"/>
-          <w:szCs w:val="20"/>
-        </w:rPr>
-      </w:pPr>
-      <w:r>
-        <w:rPr>
-          <w:rFonts w:ascii="Times New Roman" w:hAnsi="Times New Roman" w:cs="Times New Roman"/>
-          <w:sz w:val="20"/>
-          <w:szCs w:val="20"/>
-        </w:rPr>
-        <w:t xml:space="preserve">Organized </w:t>
-      </w:r>
-      <w:r>
-        <w:rPr>
-          <w:rFonts w:ascii="Times New Roman" w:hAnsi="Times New Roman" w:cs="Times New Roman"/>
-          <w:sz w:val="20"/>
-          <w:szCs w:val="20"/>
-        </w:rPr>
-        <w:t>the te</w:t>
-      </w:r>
-      <w:r>
-        <w:rPr>
-          <w:rFonts w:ascii="Times New Roman" w:hAnsi="Times New Roman" w:cs="Times New Roman"/>
-          <w:sz w:val="20"/>
-          <w:szCs w:val="20"/>
-        </w:rPr>
-        <w:t xml:space="preserve">am’s logistics </w:t>
-      </w:r>
-      <w:r>
-        <w:rPr>
-          <w:rFonts w:ascii="Times New Roman" w:hAnsi="Times New Roman" w:cs="Times New Roman"/>
-          <w:sz w:val="20"/>
-          <w:szCs w:val="20"/>
-        </w:rPr>
-        <w:t>for</w:t>
-      </w:r>
-      <w:r>
-        <w:rPr>
-          <w:rFonts w:ascii="Times New Roman" w:hAnsi="Times New Roman" w:cs="Times New Roman"/>
-          <w:sz w:val="20"/>
-          <w:szCs w:val="20"/>
-        </w:rPr>
-        <w:t xml:space="preserve"> attending the 2023</w:t>
-      </w:r>
-      <w:r>
-        <w:rPr>
-          <w:rFonts w:ascii="Times New Roman" w:hAnsi="Times New Roman" w:cs="Times New Roman"/>
-          <w:sz w:val="20"/>
-          <w:szCs w:val="20"/>
-        </w:rPr>
-        <w:t xml:space="preserve"> &amp; 2024</w:t>
-      </w:r>
-      <w:r>
-        <w:rPr>
-          <w:rFonts w:ascii="Times New Roman" w:hAnsi="Times New Roman" w:cs="Times New Roman"/>
-          <w:sz w:val="20"/>
-          <w:szCs w:val="20"/>
-        </w:rPr>
-        <w:t xml:space="preserve"> Robo</w:t>
-      </w:r>
-      <w:r>
-        <w:rPr>
-          <w:rFonts w:ascii="Times New Roman" w:hAnsi="Times New Roman" w:cs="Times New Roman"/>
-          <w:sz w:val="20"/>
-          <w:szCs w:val="20"/>
-        </w:rPr>
-        <w:t>S</w:t>
-      </w:r>
-      <w:r>
-        <w:rPr>
-          <w:rFonts w:ascii="Times New Roman" w:hAnsi="Times New Roman" w:cs="Times New Roman"/>
-          <w:sz w:val="20"/>
-          <w:szCs w:val="20"/>
-        </w:rPr>
-        <w:t>ub competition</w:t>
-      </w:r>
-      <w:r>
-        <w:rPr>
-          <w:rFonts w:ascii="Times New Roman" w:hAnsi="Times New Roman" w:cs="Times New Roman"/>
-          <w:sz w:val="20"/>
-          <w:szCs w:val="20"/>
-        </w:rPr>
-        <w:t>s</w:t>
-      </w:r>
-      <w:r>
-        <w:rPr>
-          <w:rFonts w:ascii="Times New Roman" w:hAnsi="Times New Roman" w:cs="Times New Roman"/>
-          <w:sz w:val="20"/>
-          <w:szCs w:val="20"/>
-        </w:rPr>
-        <w:t xml:space="preserve"> in </w:t>
-      </w:r>
-      <w:r>
-        <w:rPr>
-          <w:rFonts w:ascii="Times New Roman" w:hAnsi="Times New Roman" w:cs="Times New Roman"/>
-          <w:sz w:val="20"/>
-          <w:szCs w:val="20"/>
-        </w:rPr>
-        <w:t>California</w:t>
+          <w:i/>
+          <w:iCs/>
+          <w:sz w:val="20"/>
+          <w:szCs w:val="20"/>
+        </w:rPr>
+      </w:pPr>
+      <w:r>
+        <w:rPr>
+          <w:rFonts w:ascii="Times New Roman" w:hAnsi="Times New Roman" w:cs="Times New Roman"/>
+          <w:sz w:val="20"/>
+          <w:szCs w:val="20"/>
+        </w:rPr>
+        <w:t>Manag</w:t>
+      </w:r>
+      <w:r>
+        <w:rPr>
+          <w:rFonts w:ascii="Times New Roman" w:hAnsi="Times New Roman" w:cs="Times New Roman"/>
+          <w:sz w:val="20"/>
+          <w:szCs w:val="20"/>
+        </w:rPr>
+        <w:t>ed</w:t>
+      </w:r>
+      <w:r>
+        <w:rPr>
+          <w:rFonts w:ascii="Times New Roman" w:hAnsi="Times New Roman" w:cs="Times New Roman"/>
+          <w:sz w:val="20"/>
+          <w:szCs w:val="20"/>
+        </w:rPr>
+        <w:t xml:space="preserve"> day-to-day operations of the student organization including recruitment</w:t>
+      </w:r>
+      <w:r>
+        <w:rPr>
+          <w:rFonts w:ascii="Times New Roman" w:hAnsi="Times New Roman" w:cs="Times New Roman"/>
+          <w:sz w:val="20"/>
+          <w:szCs w:val="20"/>
+        </w:rPr>
+        <w:t>, finance</w:t>
+      </w:r>
+      <w:r>
+        <w:rPr>
+          <w:rFonts w:ascii="Times New Roman" w:hAnsi="Times New Roman" w:cs="Times New Roman"/>
+          <w:sz w:val="20"/>
+          <w:szCs w:val="20"/>
+        </w:rPr>
+        <w:t xml:space="preserve"> and</w:t>
+      </w:r>
+      <w:r>
+        <w:rPr>
+          <w:rFonts w:ascii="Times New Roman" w:hAnsi="Times New Roman" w:cs="Times New Roman"/>
+          <w:sz w:val="20"/>
+          <w:szCs w:val="20"/>
+        </w:rPr>
+        <w:t xml:space="preserve"> </w:t>
+      </w:r>
+      <w:r>
+        <w:rPr>
+          <w:rFonts w:ascii="Times New Roman" w:hAnsi="Times New Roman" w:cs="Times New Roman"/>
+          <w:sz w:val="20"/>
+          <w:szCs w:val="20"/>
+        </w:rPr>
+        <w:t>sponsor outreach</w:t>
       </w:r>
     </w:p>
     <w:p>
@@ -2995,136 +3287,156 @@
       </w:r>
     </w:p>
     <w:p>
-      <w:r>
-        <w:rPr>
-          <w:rFonts w:ascii="Times New Roman" w:hAnsi="Times New Roman" w:cs="Times New Roman"/>
-          <w:i/>
-          <w:iCs/>
-          <w:sz w:val="20"/>
-          <w:szCs w:val="20"/>
-        </w:rPr>
-        <w:t>Simulation Project Lead</w:t>
-      </w:r>
-      <w:r>
-        <w:rPr>
-          <w:rFonts w:ascii="Times New Roman" w:hAnsi="Times New Roman" w:cs="Times New Roman"/>
-          <w:i/>
-          <w:iCs/>
-          <w:sz w:val="20"/>
-          <w:szCs w:val="20"/>
-        </w:rPr>
-        <w:tab/>
-      </w:r>
-      <w:r>
-        <w:rPr>
-          <w:rFonts w:ascii="Times New Roman" w:hAnsi="Times New Roman" w:cs="Times New Roman"/>
-          <w:i/>
-          <w:iCs/>
-          <w:sz w:val="20"/>
-          <w:szCs w:val="20"/>
-        </w:rPr>
-        <w:tab/>
-      </w:r>
-      <w:r>
-        <w:rPr>
-          <w:rFonts w:ascii="Times New Roman" w:hAnsi="Times New Roman" w:cs="Times New Roman"/>
-          <w:i/>
-          <w:iCs/>
-          <w:sz w:val="20"/>
-          <w:szCs w:val="20"/>
-        </w:rPr>
-        <w:tab/>
-      </w:r>
-      <w:r>
-        <w:rPr>
-          <w:rFonts w:ascii="Times New Roman" w:hAnsi="Times New Roman" w:cs="Times New Roman"/>
-          <w:i/>
-          <w:iCs/>
-          <w:sz w:val="20"/>
-          <w:szCs w:val="20"/>
-        </w:rPr>
-        <w:tab/>
-      </w:r>
-      <w:r>
-        <w:rPr>
-          <w:rFonts w:ascii="Times New Roman" w:hAnsi="Times New Roman" w:cs="Times New Roman"/>
-          <w:i/>
-          <w:iCs/>
-          <w:sz w:val="20"/>
-          <w:szCs w:val="20"/>
-        </w:rPr>
-        <w:tab/>
-      </w:r>
-      <w:r>
-        <w:rPr>
-          <w:rFonts w:ascii="Times New Roman" w:hAnsi="Times New Roman" w:cs="Times New Roman"/>
-          <w:i/>
-          <w:iCs/>
-          <w:sz w:val="20"/>
-          <w:szCs w:val="20"/>
-        </w:rPr>
-        <w:tab/>
-      </w:r>
-      <w:r>
-        <w:rPr>
-          <w:rFonts w:ascii="Times New Roman" w:hAnsi="Times New Roman" w:cs="Times New Roman"/>
-          <w:i/>
-          <w:iCs/>
-          <w:sz w:val="20"/>
-          <w:szCs w:val="20"/>
-        </w:rPr>
-        <w:tab/>
-      </w:r>
-      <w:r>
-        <w:rPr>
-          <w:rFonts w:ascii="Times New Roman" w:hAnsi="Times New Roman" w:cs="Times New Roman"/>
-          <w:i/>
-          <w:iCs/>
-          <w:sz w:val="20"/>
-          <w:szCs w:val="20"/>
-        </w:rPr>
-        <w:tab/>
+      <w:pPr>
+        <w:rPr>
+          <w:rFonts w:ascii="Times New Roman" w:hAnsi="Times New Roman" w:cs="Times New Roman"/>
+          <w:b/>
+          <w:bCs/>
+          <w:sz w:val="20"/>
+          <w:szCs w:val="20"/>
+        </w:rPr>
+      </w:pPr>
+      <w:r>
+        <w:rPr>
+          <w:rFonts w:ascii="Times New Roman" w:hAnsi="Times New Roman" w:cs="Times New Roman"/>
+          <w:b/>
+          <w:bCs/>
+          <w:sz w:val="20"/>
+          <w:szCs w:val="20"/>
+        </w:rPr>
+        <w:t>U</w:t>
+      </w:r>
+      <w:r>
+        <w:rPr>
+          <w:rFonts w:ascii="Times New Roman" w:hAnsi="Times New Roman" w:cs="Times New Roman"/>
+          <w:b/>
+          <w:bCs/>
+          <w:sz w:val="20"/>
+          <w:szCs w:val="20"/>
+        </w:rPr>
+        <w:t>nderwater Intervehicle Communication Capstone</w:t>
+      </w:r>
+      <w:r>
+        <w:rPr>
+          <w:rFonts w:ascii="Times New Roman" w:hAnsi="Times New Roman" w:cs="Times New Roman"/>
+          <w:b/>
+          <w:bCs/>
+          <w:sz w:val="20"/>
+          <w:szCs w:val="20"/>
+        </w:rPr>
+        <w:t xml:space="preserve">                                                                       </w:t>
+      </w:r>
+      <w:r>
+        <w:rPr>
+          <w:rFonts w:ascii="Times New Roman" w:hAnsi="Times New Roman" w:cs="Times New Roman"/>
+          <w:b/>
+          <w:bCs/>
+          <w:sz w:val="20"/>
+          <w:szCs w:val="20"/>
+        </w:rPr>
+        <w:tab/>
+        <w:t xml:space="preserve">   Columbus, OH   </w:t>
+      </w:r>
+    </w:p>
+    <w:p>
+      <w:pPr>
+        <w:rPr>
+          <w:rFonts w:ascii="Times New Roman" w:hAnsi="Times New Roman" w:cs="Times New Roman"/>
+          <w:i/>
+          <w:sz w:val="20"/>
+          <w:szCs w:val="20"/>
+        </w:rPr>
+      </w:pPr>
+      <w:r>
+        <w:rPr>
+          <w:rFonts w:ascii="Times New Roman" w:hAnsi="Times New Roman" w:cs="Times New Roman"/>
+          <w:i/>
+          <w:sz w:val="20"/>
+          <w:szCs w:val="20"/>
+        </w:rPr>
+        <w:t>Transducer Development</w:t>
+      </w:r>
+      <w:r>
+        <w:rPr>
+          <w:rFonts w:ascii="Times New Roman" w:hAnsi="Times New Roman" w:cs="Times New Roman"/>
+          <w:i/>
+          <w:sz w:val="20"/>
+          <w:szCs w:val="20"/>
+        </w:rPr>
+        <w:t xml:space="preserve"> and Integration</w:t>
+      </w:r>
+      <w:r>
+        <w:rPr>
+          <w:rFonts w:ascii="Times New Roman" w:hAnsi="Times New Roman" w:cs="Times New Roman"/>
+          <w:i/>
+          <w:sz w:val="20"/>
+          <w:szCs w:val="20"/>
+        </w:rPr>
+        <w:tab/>
+      </w:r>
+      <w:r>
+        <w:rPr>
+          <w:rFonts w:ascii="Times New Roman" w:hAnsi="Times New Roman" w:cs="Times New Roman"/>
+          <w:i/>
+          <w:sz w:val="20"/>
+          <w:szCs w:val="20"/>
+        </w:rPr>
+        <w:tab/>
+      </w:r>
+      <w:r>
+        <w:rPr>
+          <w:rFonts w:ascii="Times New Roman" w:hAnsi="Times New Roman" w:cs="Times New Roman"/>
+          <w:i/>
+          <w:sz w:val="20"/>
+          <w:szCs w:val="20"/>
+        </w:rPr>
+        <w:tab/>
+      </w:r>
+      <w:r>
+        <w:rPr>
+          <w:rFonts w:ascii="Times New Roman" w:hAnsi="Times New Roman" w:cs="Times New Roman"/>
+          <w:i/>
+          <w:sz w:val="20"/>
+          <w:szCs w:val="20"/>
+        </w:rPr>
+        <w:tab/>
+      </w:r>
+      <w:r>
+        <w:rPr>
+          <w:rFonts w:ascii="Times New Roman" w:hAnsi="Times New Roman" w:cs="Times New Roman"/>
+          <w:i/>
+          <w:sz w:val="20"/>
+          <w:szCs w:val="20"/>
+        </w:rPr>
+        <w:tab/>
+      </w:r>
+      <w:r>
+        <w:rPr>
+          <w:rFonts w:ascii="Times New Roman" w:hAnsi="Times New Roman" w:cs="Times New Roman"/>
+          <w:i/>
+          <w:sz w:val="20"/>
+          <w:szCs w:val="20"/>
+        </w:rPr>
+        <w:tab/>
+      </w:r>
+      <w:r>
+        <w:rPr>
+          <w:rFonts w:ascii="Times New Roman" w:hAnsi="Times New Roman" w:cs="Times New Roman"/>
+          <w:i/>
+          <w:sz w:val="20"/>
+          <w:szCs w:val="20"/>
+        </w:rPr>
         <w:t xml:space="preserve">           </w:t>
       </w:r>
       <w:r>
         <w:rPr>
           <w:rFonts w:ascii="Times New Roman" w:hAnsi="Times New Roman" w:cs="Times New Roman"/>
           <w:i/>
-          <w:iCs/>
-          <w:sz w:val="20"/>
-          <w:szCs w:val="20"/>
-        </w:rPr>
-        <w:t xml:space="preserve">September 2021 </w:t>
-      </w:r>
-      <w:r>
-        <w:rPr>
-          <w:rFonts w:ascii="Times New Roman" w:hAnsi="Times New Roman" w:cs="Times New Roman"/>
-          <w:i/>
-          <w:iCs/>
-          <w:sz w:val="20"/>
-          <w:szCs w:val="20"/>
-        </w:rPr>
-        <w:t>–</w:t>
-      </w:r>
-      <w:r>
-        <w:rPr>
-          <w:rFonts w:ascii="Times New Roman" w:hAnsi="Times New Roman" w:cs="Times New Roman"/>
-          <w:i/>
-          <w:iCs/>
-          <w:sz w:val="20"/>
-          <w:szCs w:val="20"/>
-        </w:rPr>
-        <w:t xml:space="preserve"> </w:t>
-      </w:r>
-      <w:r>
-        <w:rPr>
-          <w:rFonts w:ascii="Times New Roman" w:hAnsi="Times New Roman" w:cs="Times New Roman"/>
-          <w:i/>
-          <w:iCs/>
-          <w:sz w:val="20"/>
-          <w:szCs w:val="20"/>
-        </w:rPr>
-        <w:t>May 2023</w:t>
+          <w:sz w:val="20"/>
+          <w:szCs w:val="20"/>
+        </w:rPr>
+        <w:tab/>
+        <w:t xml:space="preserve">       August 2024 - Present</w:t>
       </w:r>
     </w:p>
     <w:p>
@@ -3136,201 +3448,82 @@
         </w:numPr>
         <w:rPr>
           <w:rFonts w:ascii="Times New Roman" w:hAnsi="Times New Roman" w:cs="Times New Roman"/>
-          <w:i/>
-          <w:sz w:val="20"/>
-          <w:szCs w:val="20"/>
-        </w:rPr>
-      </w:pPr>
-      <w:r>
-        <w:rPr>
-          <w:rFonts w:ascii="Times New Roman" w:hAnsi="Times New Roman" w:cs="Times New Roman"/>
-          <w:sz w:val="20"/>
-          <w:szCs w:val="20"/>
-        </w:rPr>
-        <w:t>Created</w:t>
-      </w:r>
-      <w:r>
-        <w:rPr>
-          <w:rFonts w:ascii="Times New Roman" w:hAnsi="Times New Roman" w:cs="Times New Roman"/>
-          <w:sz w:val="20"/>
-          <w:szCs w:val="20"/>
-        </w:rPr>
-        <w:t xml:space="preserve"> Simulink physics engine</w:t>
-      </w:r>
-      <w:r>
-        <w:rPr>
-          <w:rFonts w:ascii="Times New Roman" w:hAnsi="Times New Roman" w:cs="Times New Roman"/>
-          <w:sz w:val="20"/>
-          <w:szCs w:val="20"/>
-        </w:rPr>
-        <w:t xml:space="preserve"> with </w:t>
-      </w:r>
-      <w:r>
-        <w:rPr>
-          <w:rFonts w:ascii="Times New Roman" w:hAnsi="Times New Roman" w:cs="Times New Roman"/>
-          <w:sz w:val="20"/>
-          <w:szCs w:val="20"/>
-        </w:rPr>
-        <w:t xml:space="preserve">direct integration </w:t>
-      </w:r>
-      <w:r>
-        <w:rPr>
-          <w:rFonts w:ascii="Times New Roman" w:hAnsi="Times New Roman" w:cs="Times New Roman"/>
-          <w:sz w:val="20"/>
-          <w:szCs w:val="20"/>
-        </w:rPr>
-        <w:t>into</w:t>
-      </w:r>
-      <w:r>
-        <w:rPr>
-          <w:rFonts w:ascii="Times New Roman" w:hAnsi="Times New Roman" w:cs="Times New Roman"/>
-          <w:sz w:val="20"/>
-          <w:szCs w:val="20"/>
-        </w:rPr>
-        <w:t xml:space="preserve"> robot control software (ROS 2)</w:t>
-      </w:r>
-    </w:p>
-    <w:p>
-      <w:pPr>
-        <w:rPr>
-          <w:rFonts w:ascii="Times New Roman" w:hAnsi="Times New Roman" w:cs="Times New Roman"/>
-          <w:b/>
-          <w:bCs/>
-          <w:sz w:val="20"/>
-          <w:szCs w:val="20"/>
-        </w:rPr>
-      </w:pPr>
-      <w:r>
-        <w:rPr>
-          <w:rFonts w:ascii="Times New Roman" w:hAnsi="Times New Roman" w:cs="Times New Roman"/>
-          <w:b/>
-          <w:bCs/>
-          <w:sz w:val="20"/>
-          <w:szCs w:val="20"/>
-        </w:rPr>
-        <w:t>Underwater Intervehicle Communication Capstone</w:t>
-      </w:r>
-      <w:r>
-        <w:rPr>
-          <w:rFonts w:ascii="Times New Roman" w:hAnsi="Times New Roman" w:cs="Times New Roman"/>
-          <w:b/>
-          <w:bCs/>
-          <w:sz w:val="20"/>
-          <w:szCs w:val="20"/>
-        </w:rPr>
-        <w:t xml:space="preserve">                                                                       </w:t>
-      </w:r>
-      <w:r>
-        <w:rPr>
-          <w:rFonts w:ascii="Times New Roman" w:hAnsi="Times New Roman" w:cs="Times New Roman"/>
-          <w:b/>
-          <w:bCs/>
-          <w:sz w:val="20"/>
-          <w:szCs w:val="20"/>
-        </w:rPr>
-        <w:tab/>
-        <w:t xml:space="preserve">   Columbus, OH   </w:t>
-      </w:r>
-    </w:p>
-    <w:p>
-      <w:pPr>
-        <w:rPr>
-          <w:rFonts w:ascii="Times New Roman" w:hAnsi="Times New Roman" w:cs="Times New Roman"/>
-          <w:i/>
-          <w:sz w:val="20"/>
-          <w:szCs w:val="20"/>
-        </w:rPr>
-      </w:pPr>
-      <w:r>
-        <w:rPr>
-          <w:rFonts w:ascii="Times New Roman" w:hAnsi="Times New Roman" w:cs="Times New Roman"/>
-          <w:i/>
-          <w:sz w:val="20"/>
-          <w:szCs w:val="20"/>
-        </w:rPr>
-        <w:t>Transducer Development</w:t>
-      </w:r>
-      <w:r>
-        <w:rPr>
-          <w:rFonts w:ascii="Times New Roman" w:hAnsi="Times New Roman" w:cs="Times New Roman"/>
-          <w:i/>
-          <w:sz w:val="20"/>
-          <w:szCs w:val="20"/>
-        </w:rPr>
-        <w:t xml:space="preserve"> and Integration</w:t>
-      </w:r>
-      <w:r>
-        <w:rPr>
-          <w:rFonts w:ascii="Times New Roman" w:hAnsi="Times New Roman" w:cs="Times New Roman"/>
-          <w:i/>
-          <w:sz w:val="20"/>
-          <w:szCs w:val="20"/>
-        </w:rPr>
-        <w:tab/>
-      </w:r>
-      <w:r>
-        <w:rPr>
-          <w:rFonts w:ascii="Times New Roman" w:hAnsi="Times New Roman" w:cs="Times New Roman"/>
-          <w:i/>
-          <w:sz w:val="20"/>
-          <w:szCs w:val="20"/>
-        </w:rPr>
-        <w:tab/>
-      </w:r>
-      <w:r>
-        <w:rPr>
-          <w:rFonts w:ascii="Times New Roman" w:hAnsi="Times New Roman" w:cs="Times New Roman"/>
-          <w:i/>
-          <w:sz w:val="20"/>
-          <w:szCs w:val="20"/>
-        </w:rPr>
-        <w:tab/>
-      </w:r>
-      <w:r>
-        <w:rPr>
-          <w:rFonts w:ascii="Times New Roman" w:hAnsi="Times New Roman" w:cs="Times New Roman"/>
-          <w:i/>
-          <w:sz w:val="20"/>
-          <w:szCs w:val="20"/>
-        </w:rPr>
-        <w:tab/>
-      </w:r>
-      <w:r>
-        <w:rPr>
-          <w:rFonts w:ascii="Times New Roman" w:hAnsi="Times New Roman" w:cs="Times New Roman"/>
-          <w:i/>
-          <w:sz w:val="20"/>
-          <w:szCs w:val="20"/>
-        </w:rPr>
-        <w:tab/>
-      </w:r>
-      <w:r>
-        <w:rPr>
-          <w:rFonts w:ascii="Times New Roman" w:hAnsi="Times New Roman" w:cs="Times New Roman"/>
-          <w:i/>
-          <w:sz w:val="20"/>
-          <w:szCs w:val="20"/>
-        </w:rPr>
-        <w:tab/>
-      </w:r>
-      <w:r>
-        <w:rPr>
-          <w:rFonts w:ascii="Times New Roman" w:hAnsi="Times New Roman" w:cs="Times New Roman"/>
-          <w:i/>
-          <w:sz w:val="20"/>
-          <w:szCs w:val="20"/>
-        </w:rPr>
-        <w:t xml:space="preserve">           </w:t>
-      </w:r>
-      <w:r>
-        <w:rPr>
-          <w:rFonts w:ascii="Times New Roman" w:hAnsi="Times New Roman" w:cs="Times New Roman"/>
-          <w:i/>
-          <w:sz w:val="20"/>
-          <w:szCs w:val="20"/>
-        </w:rPr>
-        <w:tab/>
-        <w:t xml:space="preserve">       August 2024 - Present</w:t>
+          <w:iCs/>
+          <w:sz w:val="20"/>
+          <w:szCs w:val="20"/>
+        </w:rPr>
+      </w:pPr>
+      <w:r>
+        <w:rPr>
+          <w:rFonts w:ascii="Times New Roman" w:hAnsi="Times New Roman" w:cs="Times New Roman"/>
+          <w:iCs/>
+          <w:sz w:val="20"/>
+          <w:szCs w:val="20"/>
+        </w:rPr>
+        <w:t xml:space="preserve">Designed a </w:t>
+      </w:r>
+      <w:r>
+        <w:rPr>
+          <w:rFonts w:ascii="Times New Roman" w:hAnsi="Times New Roman" w:cs="Times New Roman"/>
+          <w:iCs/>
+          <w:sz w:val="20"/>
+          <w:szCs w:val="20"/>
+        </w:rPr>
+        <w:t>t</w:t>
+      </w:r>
+      <w:r>
+        <w:rPr>
+          <w:rFonts w:ascii="Times New Roman" w:hAnsi="Times New Roman" w:cs="Times New Roman"/>
+          <w:iCs/>
+          <w:sz w:val="20"/>
+          <w:szCs w:val="20"/>
+        </w:rPr>
+        <w:t xml:space="preserve">ransducer </w:t>
+      </w:r>
+      <w:r>
+        <w:rPr>
+          <w:rFonts w:ascii="Times New Roman" w:hAnsi="Times New Roman" w:cs="Times New Roman"/>
+          <w:iCs/>
+          <w:sz w:val="20"/>
+          <w:szCs w:val="20"/>
+        </w:rPr>
+        <w:t>capable of</w:t>
+      </w:r>
+      <w:r>
+        <w:rPr>
+          <w:rFonts w:ascii="Times New Roman" w:hAnsi="Times New Roman" w:cs="Times New Roman"/>
+          <w:iCs/>
+          <w:sz w:val="20"/>
+          <w:szCs w:val="20"/>
+        </w:rPr>
+        <w:t xml:space="preserve"> generat</w:t>
+      </w:r>
+      <w:r>
+        <w:rPr>
+          <w:rFonts w:ascii="Times New Roman" w:hAnsi="Times New Roman" w:cs="Times New Roman"/>
+          <w:iCs/>
+          <w:sz w:val="20"/>
+          <w:szCs w:val="20"/>
+        </w:rPr>
+        <w:t xml:space="preserve">ing ultrasonic waves </w:t>
+      </w:r>
+      <w:r>
+        <w:rPr>
+          <w:rFonts w:ascii="Times New Roman" w:hAnsi="Times New Roman" w:cs="Times New Roman"/>
+          <w:iCs/>
+          <w:sz w:val="20"/>
+          <w:szCs w:val="20"/>
+        </w:rPr>
+        <w:t>while withstanding an</w:t>
+      </w:r>
+      <w:r>
+        <w:rPr>
+          <w:rFonts w:ascii="Times New Roman" w:hAnsi="Times New Roman" w:cs="Times New Roman"/>
+          <w:iCs/>
+          <w:sz w:val="20"/>
+          <w:szCs w:val="20"/>
+        </w:rPr>
+        <w:t xml:space="preserve"> underwater environment</w:t>
       </w:r>
     </w:p>
     <w:p>
@@ -3342,82 +3535,25 @@
         </w:numPr>
         <w:rPr>
           <w:rFonts w:ascii="Times New Roman" w:hAnsi="Times New Roman" w:cs="Times New Roman"/>
-          <w:iCs/>
-          <w:sz w:val="20"/>
-          <w:szCs w:val="20"/>
-        </w:rPr>
-      </w:pPr>
-      <w:r>
-        <w:rPr>
-          <w:rFonts w:ascii="Times New Roman" w:hAnsi="Times New Roman" w:cs="Times New Roman"/>
-          <w:iCs/>
-          <w:sz w:val="20"/>
-          <w:szCs w:val="20"/>
-        </w:rPr>
-        <w:t xml:space="preserve">Designed a </w:t>
-      </w:r>
-      <w:r>
-        <w:rPr>
-          <w:rFonts w:ascii="Times New Roman" w:hAnsi="Times New Roman" w:cs="Times New Roman"/>
-          <w:iCs/>
-          <w:sz w:val="20"/>
-          <w:szCs w:val="20"/>
-        </w:rPr>
-        <w:t>t</w:t>
-      </w:r>
-      <w:r>
-        <w:rPr>
-          <w:rFonts w:ascii="Times New Roman" w:hAnsi="Times New Roman" w:cs="Times New Roman"/>
-          <w:iCs/>
-          <w:sz w:val="20"/>
-          <w:szCs w:val="20"/>
-        </w:rPr>
-        <w:t xml:space="preserve">ransducer </w:t>
-      </w:r>
-      <w:r>
-        <w:rPr>
-          <w:rFonts w:ascii="Times New Roman" w:hAnsi="Times New Roman" w:cs="Times New Roman"/>
-          <w:iCs/>
-          <w:sz w:val="20"/>
-          <w:szCs w:val="20"/>
-        </w:rPr>
-        <w:t>capable of</w:t>
-      </w:r>
-      <w:r>
-        <w:rPr>
-          <w:rFonts w:ascii="Times New Roman" w:hAnsi="Times New Roman" w:cs="Times New Roman"/>
-          <w:iCs/>
-          <w:sz w:val="20"/>
-          <w:szCs w:val="20"/>
-        </w:rPr>
-        <w:t xml:space="preserve"> generat</w:t>
-      </w:r>
-      <w:r>
-        <w:rPr>
-          <w:rFonts w:ascii="Times New Roman" w:hAnsi="Times New Roman" w:cs="Times New Roman"/>
-          <w:iCs/>
-          <w:sz w:val="20"/>
-          <w:szCs w:val="20"/>
-        </w:rPr>
-        <w:t xml:space="preserve">ing ultrasonic waves </w:t>
-      </w:r>
-      <w:r>
-        <w:rPr>
-          <w:rFonts w:ascii="Times New Roman" w:hAnsi="Times New Roman" w:cs="Times New Roman"/>
-          <w:iCs/>
-          <w:sz w:val="20"/>
-          <w:szCs w:val="20"/>
-        </w:rPr>
-        <w:t>while withstanding an</w:t>
-      </w:r>
-      <w:r>
-        <w:rPr>
-          <w:rFonts w:ascii="Times New Roman" w:hAnsi="Times New Roman" w:cs="Times New Roman"/>
-          <w:iCs/>
-          <w:sz w:val="20"/>
-          <w:szCs w:val="20"/>
-        </w:rPr>
-        <w:t xml:space="preserve"> underwater environment</w:t>
+          <w:sz w:val="20"/>
+          <w:szCs w:val="20"/>
+        </w:rPr>
+      </w:pPr>
+      <w:r>
+        <w:rPr>
+          <w:rFonts w:ascii="Times New Roman" w:hAnsi="Times New Roman" w:cs="Times New Roman"/>
+          <w:sz w:val="20"/>
+          <w:szCs w:val="20"/>
+        </w:rPr>
+        <w:t xml:space="preserve">Simulated </w:t>
+      </w:r>
+      <w:r>
+        <w:rPr>
+          <w:rFonts w:ascii="Times New Roman" w:hAnsi="Times New Roman" w:cs="Times New Roman"/>
+          <w:sz w:val="20"/>
+          <w:szCs w:val="20"/>
+        </w:rPr>
+        <w:t xml:space="preserve">the transducer design using Ansys to ensure the device met intensity and frequency requirements </w:t>
       </w:r>
     </w:p>
     <w:p>
@@ -3439,15 +3575,274 @@
           <w:sz w:val="20"/>
           <w:szCs w:val="20"/>
         </w:rPr>
-        <w:t xml:space="preserve">Simulated </w:t>
-      </w:r>
-      <w:r>
-        <w:rPr>
-          <w:rFonts w:ascii="Times New Roman" w:hAnsi="Times New Roman" w:cs="Times New Roman"/>
-          <w:sz w:val="20"/>
-          <w:szCs w:val="20"/>
-        </w:rPr>
-        <w:t xml:space="preserve">the transducer design using Ansys to ensure the device met intensity and frequency requirements </w:t>
+        <w:t>Manufactur</w:t>
+      </w:r>
+      <w:r>
+        <w:rPr>
+          <w:rFonts w:ascii="Times New Roman" w:hAnsi="Times New Roman" w:cs="Times New Roman"/>
+          <w:sz w:val="20"/>
+          <w:szCs w:val="20"/>
+        </w:rPr>
+        <w:t>ed</w:t>
+      </w:r>
+      <w:r>
+        <w:rPr>
+          <w:rFonts w:ascii="Times New Roman" w:hAnsi="Times New Roman" w:cs="Times New Roman"/>
+          <w:sz w:val="20"/>
+          <w:szCs w:val="20"/>
+        </w:rPr>
+        <w:t xml:space="preserve"> and integra</w:t>
+      </w:r>
+      <w:r>
+        <w:rPr>
+          <w:rFonts w:ascii="Times New Roman" w:hAnsi="Times New Roman" w:cs="Times New Roman"/>
+          <w:sz w:val="20"/>
+          <w:szCs w:val="20"/>
+        </w:rPr>
+        <w:t>ted</w:t>
+      </w:r>
+      <w:r>
+        <w:rPr>
+          <w:rFonts w:ascii="Times New Roman" w:hAnsi="Times New Roman" w:cs="Times New Roman"/>
+          <w:sz w:val="20"/>
+          <w:szCs w:val="20"/>
+        </w:rPr>
+        <w:t xml:space="preserve"> </w:t>
+      </w:r>
+      <w:r>
+        <w:rPr>
+          <w:rFonts w:ascii="Times New Roman" w:hAnsi="Times New Roman" w:cs="Times New Roman"/>
+          <w:sz w:val="20"/>
+          <w:szCs w:val="20"/>
+        </w:rPr>
+        <w:t>the transducer</w:t>
+      </w:r>
+      <w:r>
+        <w:rPr>
+          <w:rFonts w:ascii="Times New Roman" w:hAnsi="Times New Roman" w:cs="Times New Roman"/>
+          <w:sz w:val="20"/>
+          <w:szCs w:val="20"/>
+        </w:rPr>
+        <w:t xml:space="preserve"> to ensure successful communication between sub-sea vehicles</w:t>
+      </w:r>
+    </w:p>
+    <w:p>
+      <w:pPr>
+        <w:rPr>
+          <w:rFonts w:ascii="Times New Roman" w:hAnsi="Times New Roman" w:cs="Times New Roman"/>
+          <w:b/>
+          <w:sz w:val="20"/>
+          <w:szCs w:val="20"/>
+        </w:rPr>
+      </w:pPr>
+      <w:r>
+        <w:rPr>
+          <w:rFonts w:ascii="Times New Roman" w:hAnsi="Times New Roman" w:cs="Times New Roman"/>
+          <w:b/>
+          <w:sz w:val="20"/>
+          <w:szCs w:val="20"/>
+        </w:rPr>
+        <w:t>Autonomous Underwater Vehicle</w:t>
+      </w:r>
+      <w:r>
+        <w:rPr>
+          <w:rFonts w:ascii="Times New Roman" w:hAnsi="Times New Roman" w:cs="Times New Roman"/>
+          <w:b/>
+          <w:sz w:val="20"/>
+          <w:szCs w:val="20"/>
+        </w:rPr>
+        <w:t xml:space="preserve"> Restoration</w:t>
+      </w:r>
+      <w:r>
+        <w:rPr>
+          <w:rFonts w:ascii="Times New Roman" w:hAnsi="Times New Roman" w:cs="Times New Roman"/>
+          <w:b/>
+          <w:sz w:val="20"/>
+          <w:szCs w:val="20"/>
+        </w:rPr>
+        <w:t xml:space="preserve"> Research</w:t>
+      </w:r>
+      <w:r>
+        <w:rPr>
+          <w:rFonts w:ascii="Times New Roman" w:hAnsi="Times New Roman" w:cs="Times New Roman"/>
+          <w:b/>
+          <w:sz w:val="20"/>
+          <w:szCs w:val="20"/>
+        </w:rPr>
+        <w:tab/>
+      </w:r>
+      <w:r>
+        <w:rPr>
+          <w:rFonts w:ascii="Times New Roman" w:hAnsi="Times New Roman" w:cs="Times New Roman"/>
+          <w:b/>
+          <w:sz w:val="20"/>
+          <w:szCs w:val="20"/>
+        </w:rPr>
+        <w:t xml:space="preserve">      </w:t>
+      </w:r>
+      <w:r>
+        <w:rPr>
+          <w:rFonts w:ascii="Times New Roman" w:hAnsi="Times New Roman" w:cs="Times New Roman"/>
+          <w:b/>
+          <w:sz w:val="20"/>
+          <w:szCs w:val="20"/>
+        </w:rPr>
+        <w:tab/>
+      </w:r>
+      <w:r>
+        <w:rPr>
+          <w:rFonts w:ascii="Times New Roman" w:hAnsi="Times New Roman" w:cs="Times New Roman"/>
+          <w:b/>
+          <w:sz w:val="20"/>
+          <w:szCs w:val="20"/>
+        </w:rPr>
+        <w:tab/>
+      </w:r>
+      <w:r>
+        <w:rPr>
+          <w:rFonts w:ascii="Times New Roman" w:hAnsi="Times New Roman" w:cs="Times New Roman"/>
+          <w:b/>
+          <w:sz w:val="20"/>
+          <w:szCs w:val="20"/>
+        </w:rPr>
+        <w:tab/>
+      </w:r>
+      <w:r>
+        <w:rPr>
+          <w:rFonts w:ascii="Times New Roman" w:hAnsi="Times New Roman" w:cs="Times New Roman"/>
+          <w:b/>
+          <w:sz w:val="20"/>
+          <w:szCs w:val="20"/>
+        </w:rPr>
+        <w:tab/>
+      </w:r>
+      <w:r>
+        <w:rPr>
+          <w:rFonts w:ascii="Times New Roman" w:hAnsi="Times New Roman" w:cs="Times New Roman"/>
+          <w:b/>
+          <w:sz w:val="20"/>
+          <w:szCs w:val="20"/>
+        </w:rPr>
+        <w:tab/>
+        <w:t xml:space="preserve">   Columbus, OH</w:t>
+      </w:r>
+      <w:r>
+        <w:rPr>
+          <w:rFonts w:ascii="Times New Roman" w:hAnsi="Times New Roman" w:cs="Times New Roman"/>
+          <w:b/>
+          <w:sz w:val="20"/>
+          <w:szCs w:val="20"/>
+        </w:rPr>
+        <w:t xml:space="preserve"> </w:t>
+      </w:r>
+    </w:p>
+    <w:p>
+      <w:pPr>
+        <w:rPr>
+          <w:rFonts w:ascii="Times New Roman" w:hAnsi="Times New Roman" w:cs="Times New Roman"/>
+          <w:i/>
+          <w:iCs/>
+          <w:sz w:val="20"/>
+          <w:szCs w:val="20"/>
+        </w:rPr>
+      </w:pPr>
+      <w:r>
+        <w:rPr>
+          <w:rFonts w:ascii="Times New Roman" w:hAnsi="Times New Roman" w:cs="Times New Roman"/>
+          <w:i/>
+          <w:iCs/>
+          <w:sz w:val="20"/>
+          <w:szCs w:val="20"/>
+        </w:rPr>
+        <w:t>Mechanical</w:t>
+      </w:r>
+      <w:r>
+        <w:rPr>
+          <w:rFonts w:ascii="Times New Roman" w:hAnsi="Times New Roman" w:cs="Times New Roman"/>
+          <w:i/>
+          <w:iCs/>
+          <w:sz w:val="20"/>
+          <w:szCs w:val="20"/>
+        </w:rPr>
+        <w:t xml:space="preserve"> Redesign </w:t>
+      </w:r>
+      <w:r>
+        <w:rPr>
+          <w:rFonts w:ascii="Times New Roman" w:hAnsi="Times New Roman" w:cs="Times New Roman"/>
+          <w:i/>
+          <w:iCs/>
+          <w:sz w:val="20"/>
+          <w:szCs w:val="20"/>
+        </w:rPr>
+        <w:t>&amp; Controls</w:t>
+      </w:r>
+      <w:r>
+        <w:tab/>
+      </w:r>
+      <w:r>
+        <w:tab/>
+      </w:r>
+      <w:r>
+        <w:tab/>
+      </w:r>
+      <w:r>
+        <w:tab/>
+      </w:r>
+      <w:r>
+        <w:tab/>
+      </w:r>
+      <w:r>
+        <w:tab/>
+      </w:r>
+      <w:r>
+        <w:rPr>
+          <w:rFonts w:ascii="Times New Roman" w:hAnsi="Times New Roman" w:cs="Times New Roman"/>
+          <w:i/>
+          <w:iCs/>
+          <w:sz w:val="20"/>
+          <w:szCs w:val="20"/>
+        </w:rPr>
+        <w:t xml:space="preserve">                       </w:t>
+      </w:r>
+      <w:r>
+        <w:rPr>
+          <w:rFonts w:ascii="Times New Roman" w:hAnsi="Times New Roman" w:cs="Times New Roman"/>
+          <w:i/>
+          <w:iCs/>
+          <w:sz w:val="20"/>
+          <w:szCs w:val="20"/>
+        </w:rPr>
+        <w:t xml:space="preserve">      January 2023 </w:t>
+      </w:r>
+      <w:r>
+        <w:rPr>
+          <w:rFonts w:ascii="Times New Roman" w:hAnsi="Times New Roman" w:cs="Times New Roman"/>
+          <w:i/>
+          <w:iCs/>
+          <w:sz w:val="20"/>
+          <w:szCs w:val="20"/>
+        </w:rPr>
+        <w:t>–</w:t>
+      </w:r>
+      <w:r>
+        <w:rPr>
+          <w:rFonts w:ascii="Times New Roman" w:hAnsi="Times New Roman" w:cs="Times New Roman"/>
+          <w:i/>
+          <w:iCs/>
+          <w:sz w:val="20"/>
+          <w:szCs w:val="20"/>
+        </w:rPr>
+        <w:t xml:space="preserve"> </w:t>
+      </w:r>
+      <w:r>
+        <w:rPr>
+          <w:rFonts w:ascii="Times New Roman" w:hAnsi="Times New Roman" w:cs="Times New Roman"/>
+          <w:i/>
+          <w:iCs/>
+          <w:sz w:val="20"/>
+          <w:szCs w:val="20"/>
+        </w:rPr>
+        <w:t>May 2023</w:t>
       </w:r>
     </w:p>
     <w:p>
@@ -3459,21 +3854,33 @@
         </w:numPr>
         <w:rPr>
           <w:rFonts w:ascii="Times New Roman" w:hAnsi="Times New Roman" w:cs="Times New Roman"/>
-          <w:sz w:val="20"/>
-          <w:szCs w:val="20"/>
-        </w:rPr>
-      </w:pPr>
-      <w:r>
-        <w:rPr>
-          <w:rFonts w:ascii="Times New Roman" w:hAnsi="Times New Roman" w:cs="Times New Roman"/>
-          <w:sz w:val="20"/>
-          <w:szCs w:val="20"/>
-        </w:rPr>
-        <w:t>Manufactur</w:t>
-      </w:r>
-      <w:r>
-        <w:rPr>
-          <w:rFonts w:ascii="Times New Roman" w:hAnsi="Times New Roman" w:cs="Times New Roman"/>
+          <w:i/>
+          <w:sz w:val="20"/>
+          <w:szCs w:val="20"/>
+        </w:rPr>
+      </w:pPr>
+      <w:r>
+        <w:rPr>
+          <w:rFonts w:ascii="Times New Roman" w:hAnsi="Times New Roman" w:cs="Times New Roman"/>
+          <w:iCs/>
+          <w:sz w:val="20"/>
+          <w:szCs w:val="20"/>
+        </w:rPr>
+        <w:t>Red</w:t>
+      </w:r>
+      <w:r>
+        <w:rPr>
+          <w:rFonts w:ascii="Times New Roman" w:hAnsi="Times New Roman" w:cs="Times New Roman"/>
+          <w:iCs/>
+          <w:sz w:val="20"/>
+          <w:szCs w:val="20"/>
+        </w:rPr>
+        <w:t>esign</w:t>
+      </w:r>
+      <w:r>
+        <w:rPr>
+          <w:rFonts w:ascii="Times New Roman" w:hAnsi="Times New Roman" w:cs="Times New Roman"/>
+          <w:iCs/>
           <w:sz w:val="20"/>
           <w:szCs w:val="20"/>
         </w:rPr>
@@ -3482,263 +3889,29 @@
       <w:r>
         <w:rPr>
           <w:rFonts w:ascii="Times New Roman" w:hAnsi="Times New Roman" w:cs="Times New Roman"/>
-          <w:sz w:val="20"/>
-          <w:szCs w:val="20"/>
-        </w:rPr>
-        <w:t xml:space="preserve"> and integra</w:t>
-      </w:r>
-      <w:r>
-        <w:rPr>
-          <w:rFonts w:ascii="Times New Roman" w:hAnsi="Times New Roman" w:cs="Times New Roman"/>
-          <w:sz w:val="20"/>
-          <w:szCs w:val="20"/>
-        </w:rPr>
-        <w:t>ted</w:t>
-      </w:r>
-      <w:r>
-        <w:rPr>
-          <w:rFonts w:ascii="Times New Roman" w:hAnsi="Times New Roman" w:cs="Times New Roman"/>
-          <w:sz w:val="20"/>
-          <w:szCs w:val="20"/>
-        </w:rPr>
-        <w:t xml:space="preserve"> </w:t>
-      </w:r>
-      <w:proofErr w:type="gramStart"/>
-      <w:r>
-        <w:rPr>
-          <w:rFonts w:ascii="Times New Roman" w:hAnsi="Times New Roman" w:cs="Times New Roman"/>
-          <w:sz w:val="20"/>
-          <w:szCs w:val="20"/>
-        </w:rPr>
-        <w:t>the transducer</w:t>
-      </w:r>
-      <w:proofErr w:type="gramEnd"/>
-      <w:r>
-        <w:rPr>
-          <w:rFonts w:ascii="Times New Roman" w:hAnsi="Times New Roman" w:cs="Times New Roman"/>
-          <w:sz w:val="20"/>
-          <w:szCs w:val="20"/>
-        </w:rPr>
-        <w:t xml:space="preserve"> to ensure successful communication between sub-sea vehicles</w:t>
-      </w:r>
-    </w:p>
-    <w:p>
-      <w:pPr>
-        <w:rPr>
-          <w:rFonts w:ascii="Times New Roman" w:hAnsi="Times New Roman" w:cs="Times New Roman"/>
-          <w:b/>
-          <w:sz w:val="20"/>
-          <w:szCs w:val="20"/>
-        </w:rPr>
-      </w:pPr>
-      <w:r>
-        <w:rPr>
-          <w:rFonts w:ascii="Times New Roman" w:hAnsi="Times New Roman" w:cs="Times New Roman"/>
-          <w:b/>
-          <w:sz w:val="20"/>
-          <w:szCs w:val="20"/>
-        </w:rPr>
-        <w:t>Autonomous Underwater Vehicle</w:t>
-      </w:r>
-      <w:r>
-        <w:rPr>
-          <w:rFonts w:ascii="Times New Roman" w:hAnsi="Times New Roman" w:cs="Times New Roman"/>
-          <w:b/>
-          <w:sz w:val="20"/>
-          <w:szCs w:val="20"/>
-        </w:rPr>
-        <w:t xml:space="preserve"> Restoration</w:t>
-      </w:r>
-      <w:r>
-        <w:rPr>
-          <w:rFonts w:ascii="Times New Roman" w:hAnsi="Times New Roman" w:cs="Times New Roman"/>
-          <w:b/>
-          <w:sz w:val="20"/>
-          <w:szCs w:val="20"/>
-        </w:rPr>
-        <w:t xml:space="preserve"> Research</w:t>
-      </w:r>
-      <w:r>
-        <w:rPr>
-          <w:rFonts w:ascii="Times New Roman" w:hAnsi="Times New Roman" w:cs="Times New Roman"/>
-          <w:b/>
-          <w:sz w:val="20"/>
-          <w:szCs w:val="20"/>
-        </w:rPr>
-        <w:tab/>
-      </w:r>
-      <w:r>
-        <w:rPr>
-          <w:rFonts w:ascii="Times New Roman" w:hAnsi="Times New Roman" w:cs="Times New Roman"/>
-          <w:b/>
-          <w:sz w:val="20"/>
-          <w:szCs w:val="20"/>
-        </w:rPr>
-        <w:t xml:space="preserve">      </w:t>
-      </w:r>
-      <w:r>
-        <w:rPr>
-          <w:rFonts w:ascii="Times New Roman" w:hAnsi="Times New Roman" w:cs="Times New Roman"/>
-          <w:b/>
-          <w:sz w:val="20"/>
-          <w:szCs w:val="20"/>
-        </w:rPr>
-        <w:tab/>
-      </w:r>
-      <w:r>
-        <w:rPr>
-          <w:rFonts w:ascii="Times New Roman" w:hAnsi="Times New Roman" w:cs="Times New Roman"/>
-          <w:b/>
-          <w:sz w:val="20"/>
-          <w:szCs w:val="20"/>
-        </w:rPr>
-        <w:tab/>
-      </w:r>
-      <w:r>
-        <w:rPr>
-          <w:rFonts w:ascii="Times New Roman" w:hAnsi="Times New Roman" w:cs="Times New Roman"/>
-          <w:b/>
-          <w:sz w:val="20"/>
-          <w:szCs w:val="20"/>
-        </w:rPr>
-        <w:tab/>
-      </w:r>
-      <w:r>
-        <w:rPr>
-          <w:rFonts w:ascii="Times New Roman" w:hAnsi="Times New Roman" w:cs="Times New Roman"/>
-          <w:b/>
-          <w:sz w:val="20"/>
-          <w:szCs w:val="20"/>
-        </w:rPr>
-        <w:tab/>
-      </w:r>
-      <w:r>
-        <w:rPr>
-          <w:rFonts w:ascii="Times New Roman" w:hAnsi="Times New Roman" w:cs="Times New Roman"/>
-          <w:b/>
-          <w:sz w:val="20"/>
-          <w:szCs w:val="20"/>
-        </w:rPr>
-        <w:tab/>
-        <w:t xml:space="preserve">   Columbus, OH</w:t>
-      </w:r>
-      <w:r>
-        <w:rPr>
-          <w:rFonts w:ascii="Times New Roman" w:hAnsi="Times New Roman" w:cs="Times New Roman"/>
-          <w:b/>
-          <w:sz w:val="20"/>
-          <w:szCs w:val="20"/>
-        </w:rPr>
-        <w:t xml:space="preserve"> </w:t>
-      </w:r>
-    </w:p>
-    <w:p>
-      <w:pPr>
-        <w:rPr>
-          <w:rFonts w:ascii="Times New Roman" w:hAnsi="Times New Roman" w:cs="Times New Roman"/>
-          <w:i/>
-          <w:iCs/>
-          <w:sz w:val="20"/>
-          <w:szCs w:val="20"/>
-        </w:rPr>
-      </w:pPr>
-      <w:r>
-        <w:rPr>
-          <w:rFonts w:ascii="Times New Roman" w:hAnsi="Times New Roman" w:cs="Times New Roman"/>
-          <w:i/>
-          <w:iCs/>
-          <w:sz w:val="20"/>
-          <w:szCs w:val="20"/>
-        </w:rPr>
-        <w:t>Mechanical</w:t>
-      </w:r>
-      <w:r>
-        <w:rPr>
-          <w:rFonts w:ascii="Times New Roman" w:hAnsi="Times New Roman" w:cs="Times New Roman"/>
-          <w:i/>
-          <w:iCs/>
-          <w:sz w:val="20"/>
-          <w:szCs w:val="20"/>
-        </w:rPr>
-        <w:t xml:space="preserve"> Redesign </w:t>
-      </w:r>
-      <w:r>
-        <w:rPr>
-          <w:rFonts w:ascii="Times New Roman" w:hAnsi="Times New Roman" w:cs="Times New Roman"/>
-          <w:i/>
-          <w:iCs/>
-          <w:sz w:val="20"/>
-          <w:szCs w:val="20"/>
-        </w:rPr>
-        <w:t>&amp; Controls</w:t>
-      </w:r>
-      <w:r>
-        <w:tab/>
-      </w:r>
-      <w:r>
-        <w:tab/>
-      </w:r>
-      <w:r>
-        <w:tab/>
-      </w:r>
-      <w:r>
-        <w:tab/>
-      </w:r>
-      <w:r>
-        <w:tab/>
-      </w:r>
-      <w:r>
-        <w:tab/>
-      </w:r>
-      <w:r>
-        <w:rPr>
-          <w:rFonts w:ascii="Times New Roman" w:hAnsi="Times New Roman" w:cs="Times New Roman"/>
-          <w:i/>
-          <w:iCs/>
-          <w:sz w:val="20"/>
-          <w:szCs w:val="20"/>
-        </w:rPr>
-        <w:t xml:space="preserve">                       </w:t>
-      </w:r>
-      <w:r>
-        <w:rPr>
-          <w:rFonts w:ascii="Times New Roman" w:hAnsi="Times New Roman" w:cs="Times New Roman"/>
-          <w:i/>
-          <w:iCs/>
-          <w:sz w:val="20"/>
-          <w:szCs w:val="20"/>
-        </w:rPr>
-        <w:t xml:space="preserve">      January 2023 </w:t>
-      </w:r>
-      <w:r>
-        <w:rPr>
-          <w:rFonts w:ascii="Times New Roman" w:hAnsi="Times New Roman" w:cs="Times New Roman"/>
-          <w:i/>
-          <w:iCs/>
-          <w:sz w:val="20"/>
-          <w:szCs w:val="20"/>
-        </w:rPr>
-        <w:t>–</w:t>
-      </w:r>
-      <w:r>
-        <w:rPr>
-          <w:rFonts w:ascii="Times New Roman" w:hAnsi="Times New Roman" w:cs="Times New Roman"/>
-          <w:i/>
-          <w:iCs/>
-          <w:sz w:val="20"/>
-          <w:szCs w:val="20"/>
-        </w:rPr>
-        <w:t xml:space="preserve"> </w:t>
-      </w:r>
-      <w:r>
-        <w:rPr>
-          <w:rFonts w:ascii="Times New Roman" w:hAnsi="Times New Roman" w:cs="Times New Roman"/>
-          <w:i/>
-          <w:iCs/>
-          <w:sz w:val="20"/>
-          <w:szCs w:val="20"/>
-        </w:rPr>
-        <w:t>May 2023</w:t>
+          <w:iCs/>
+          <w:sz w:val="20"/>
+          <w:szCs w:val="20"/>
+        </w:rPr>
+        <w:t xml:space="preserve"> physical components to </w:t>
+      </w:r>
+      <w:r>
+        <w:rPr>
+          <w:rFonts w:ascii="Times New Roman" w:hAnsi="Times New Roman" w:cs="Times New Roman"/>
+          <w:iCs/>
+          <w:sz w:val="20"/>
+          <w:szCs w:val="20"/>
+        </w:rPr>
+        <w:t xml:space="preserve">reduce vehicle weight </w:t>
+      </w:r>
+      <w:r>
+        <w:rPr>
+          <w:rFonts w:ascii="Times New Roman" w:hAnsi="Times New Roman" w:cs="Times New Roman"/>
+          <w:iCs/>
+          <w:sz w:val="20"/>
+          <w:szCs w:val="20"/>
+        </w:rPr>
+        <w:t>and accommodate new technology</w:t>
       </w:r>
     </w:p>
     <w:p>
@@ -3762,75 +3935,6 @@
           <w:sz w:val="20"/>
           <w:szCs w:val="20"/>
         </w:rPr>
-        <w:t>Red</w:t>
-      </w:r>
-      <w:r>
-        <w:rPr>
-          <w:rFonts w:ascii="Times New Roman" w:hAnsi="Times New Roman" w:cs="Times New Roman"/>
-          <w:iCs/>
-          <w:sz w:val="20"/>
-          <w:szCs w:val="20"/>
-        </w:rPr>
-        <w:t>esign</w:t>
-      </w:r>
-      <w:r>
-        <w:rPr>
-          <w:rFonts w:ascii="Times New Roman" w:hAnsi="Times New Roman" w:cs="Times New Roman"/>
-          <w:iCs/>
-          <w:sz w:val="20"/>
-          <w:szCs w:val="20"/>
-        </w:rPr>
-        <w:t>ed</w:t>
-      </w:r>
-      <w:r>
-        <w:rPr>
-          <w:rFonts w:ascii="Times New Roman" w:hAnsi="Times New Roman" w:cs="Times New Roman"/>
-          <w:iCs/>
-          <w:sz w:val="20"/>
-          <w:szCs w:val="20"/>
-        </w:rPr>
-        <w:t xml:space="preserve"> physical components to </w:t>
-      </w:r>
-      <w:r>
-        <w:rPr>
-          <w:rFonts w:ascii="Times New Roman" w:hAnsi="Times New Roman" w:cs="Times New Roman"/>
-          <w:iCs/>
-          <w:sz w:val="20"/>
-          <w:szCs w:val="20"/>
-        </w:rPr>
-        <w:t xml:space="preserve">reduce vehicle weight </w:t>
-      </w:r>
-      <w:r>
-        <w:rPr>
-          <w:rFonts w:ascii="Times New Roman" w:hAnsi="Times New Roman" w:cs="Times New Roman"/>
-          <w:iCs/>
-          <w:sz w:val="20"/>
-          <w:szCs w:val="20"/>
-        </w:rPr>
-        <w:t>and accommodate new technology</w:t>
-      </w:r>
-    </w:p>
-    <w:p>
-      <w:pPr>
-        <w:pStyle w:val="ListParagraph"/>
-        <w:numPr>
-          <w:ilvl w:val="0"/>
-          <w:numId w:val="4"/>
-        </w:numPr>
-        <w:rPr>
-          <w:rFonts w:ascii="Times New Roman" w:hAnsi="Times New Roman" w:cs="Times New Roman"/>
-          <w:i/>
-          <w:sz w:val="20"/>
-          <w:szCs w:val="20"/>
-        </w:rPr>
-      </w:pPr>
-      <w:r>
-        <w:rPr>
-          <w:rFonts w:ascii="Times New Roman" w:hAnsi="Times New Roman" w:cs="Times New Roman"/>
-          <w:iCs/>
-          <w:sz w:val="20"/>
-          <w:szCs w:val="20"/>
-        </w:rPr>
         <w:t>Machined several parts using a vertical mill, lathe</w:t>
       </w:r>
       <w:r>
@@ -3938,41 +4042,13 @@
         </w:rPr>
         <w:t xml:space="preserve"> Experience: </w:t>
       </w:r>
-      <w:proofErr w:type="spellStart"/>
-      <w:r>
-        <w:rPr>
-          <w:rFonts w:ascii="Times New Roman" w:hAnsi="Times New Roman" w:cs="Times New Roman"/>
-          <w:sz w:val="20"/>
-          <w:szCs w:val="20"/>
-        </w:rPr>
-        <w:t>Solidworks</w:t>
-      </w:r>
-      <w:proofErr w:type="spellEnd"/>
-      <w:r>
-        <w:rPr>
-          <w:rFonts w:ascii="Times New Roman" w:hAnsi="Times New Roman" w:cs="Times New Roman"/>
-          <w:sz w:val="20"/>
-          <w:szCs w:val="20"/>
-        </w:rPr>
-        <w:t xml:space="preserve">, Fusion 360, Autodesk Inventor, </w:t>
-      </w:r>
-      <w:proofErr w:type="spellStart"/>
-      <w:r>
-        <w:rPr>
-          <w:rFonts w:ascii="Times New Roman" w:hAnsi="Times New Roman" w:cs="Times New Roman"/>
-          <w:sz w:val="20"/>
-          <w:szCs w:val="20"/>
-        </w:rPr>
-        <w:t>Onshape</w:t>
-      </w:r>
-      <w:proofErr w:type="spellEnd"/>
-      <w:r>
-        <w:rPr>
-          <w:rFonts w:ascii="Times New Roman" w:hAnsi="Times New Roman" w:cs="Times New Roman"/>
-          <w:sz w:val="20"/>
-          <w:szCs w:val="20"/>
-        </w:rPr>
-        <w:t>, Cura</w:t>
+      <w:r>
+        <w:rPr>
+          <w:rFonts w:ascii="Times New Roman" w:hAnsi="Times New Roman" w:cs="Times New Roman"/>
+          <w:sz w:val="20"/>
+          <w:szCs w:val="20"/>
+        </w:rPr>
+        <w:t>Solidworks, Fusion 360, Autodesk Inventor, Onshape, Cura</w:t>
       </w:r>
       <w:r>
         <w:rPr>
@@ -4014,65 +4090,23 @@
         </w:rPr>
         <w:t xml:space="preserve">Software Development Experience: </w:t>
       </w:r>
-      <w:proofErr w:type="spellStart"/>
-      <w:r>
-        <w:rPr>
-          <w:rFonts w:ascii="Times New Roman" w:hAnsi="Times New Roman" w:cs="Times New Roman"/>
-          <w:iCs/>
-          <w:sz w:val="20"/>
-          <w:szCs w:val="20"/>
-        </w:rPr>
-        <w:t>Matlab</w:t>
-      </w:r>
-      <w:proofErr w:type="spellEnd"/>
-      <w:r>
-        <w:rPr>
-          <w:rFonts w:ascii="Times New Roman" w:hAnsi="Times New Roman" w:cs="Times New Roman"/>
-          <w:iCs/>
-          <w:sz w:val="20"/>
-          <w:szCs w:val="20"/>
-        </w:rPr>
-        <w:t>, C/C++/C#, Python, ROS 2, Git/</w:t>
-      </w:r>
-      <w:proofErr w:type="spellStart"/>
-      <w:r>
-        <w:rPr>
-          <w:rFonts w:ascii="Times New Roman" w:hAnsi="Times New Roman" w:cs="Times New Roman"/>
-          <w:iCs/>
-          <w:sz w:val="20"/>
-          <w:szCs w:val="20"/>
-        </w:rPr>
-        <w:t>Github</w:t>
-      </w:r>
-      <w:proofErr w:type="spellEnd"/>
-      <w:r>
-        <w:rPr>
-          <w:rFonts w:ascii="Times New Roman" w:hAnsi="Times New Roman" w:cs="Times New Roman"/>
-          <w:iCs/>
-          <w:sz w:val="20"/>
-          <w:szCs w:val="20"/>
-        </w:rPr>
-        <w:t xml:space="preserve">, </w:t>
-      </w:r>
-      <w:proofErr w:type="spellStart"/>
-      <w:r>
-        <w:rPr>
-          <w:rFonts w:ascii="Times New Roman" w:hAnsi="Times New Roman" w:cs="Times New Roman"/>
-          <w:iCs/>
-          <w:sz w:val="20"/>
-          <w:szCs w:val="20"/>
-        </w:rPr>
-        <w:t>Solidworks</w:t>
-      </w:r>
-      <w:proofErr w:type="spellEnd"/>
-      <w:r>
-        <w:rPr>
-          <w:rFonts w:ascii="Times New Roman" w:hAnsi="Times New Roman" w:cs="Times New Roman"/>
-          <w:iCs/>
-          <w:sz w:val="20"/>
-          <w:szCs w:val="20"/>
-        </w:rPr>
-        <w:t xml:space="preserve"> VBA</w:t>
+      <w:r>
+        <w:rPr>
+          <w:rFonts w:ascii="Times New Roman" w:hAnsi="Times New Roman" w:cs="Times New Roman"/>
+          <w:iCs/>
+          <w:sz w:val="20"/>
+          <w:szCs w:val="20"/>
+        </w:rPr>
+        <w:t>Matlab, C/C++/C#, Python, ROS 2, Git/Github</w:t>
+      </w:r>
+      <w:r>
+        <w:rPr>
+          <w:rFonts w:ascii="Times New Roman" w:hAnsi="Times New Roman" w:cs="Times New Roman"/>
+          <w:iCs/>
+          <w:sz w:val="20"/>
+          <w:szCs w:val="20"/>
+        </w:rPr>
+        <w:t>, Solidworks VBA</w:t>
       </w:r>
     </w:p>
     <w:p>
@@ -4231,25 +4265,14 @@
         </w:rPr>
         <w:t xml:space="preserve"> </w:t>
       </w:r>
-      <w:proofErr w:type="spellStart"/>
-      <w:r>
-        <w:rPr>
-          <w:rFonts w:ascii="Times New Roman" w:hAnsi="Times New Roman" w:cs="Times New Roman"/>
-          <w:iCs/>
-          <w:sz w:val="20"/>
-          <w:szCs w:val="20"/>
-        </w:rPr>
-        <w:t>Perfboarding</w:t>
-      </w:r>
-      <w:proofErr w:type="spellEnd"/>
-      <w:r>
-        <w:rPr>
-          <w:rFonts w:ascii="Times New Roman" w:hAnsi="Times New Roman" w:cs="Times New Roman"/>
-          <w:iCs/>
-          <w:sz w:val="20"/>
-          <w:szCs w:val="20"/>
-        </w:rPr>
-        <w:t>, Breadboarding</w:t>
+      <w:r>
+        <w:rPr>
+          <w:rFonts w:ascii="Times New Roman" w:hAnsi="Times New Roman" w:cs="Times New Roman"/>
+          <w:iCs/>
+          <w:sz w:val="20"/>
+          <w:szCs w:val="20"/>
+        </w:rPr>
+        <w:t>Perfboarding, Breadboarding</w:t>
       </w:r>
     </w:p>
     <w:p>
@@ -4312,19 +4335,8 @@
           <w:sz w:val="20"/>
           <w:szCs w:val="20"/>
         </w:rPr>
-        <w:t xml:space="preserve">, </w:t>
-      </w:r>
-      <w:proofErr w:type="spellStart"/>
-      <w:r>
-        <w:rPr>
-          <w:rFonts w:ascii="Times New Roman" w:hAnsi="Times New Roman" w:cs="Times New Roman"/>
-          <w:iCs/>
-          <w:sz w:val="20"/>
-          <w:szCs w:val="20"/>
-        </w:rPr>
-        <w:t>LaTex</w:t>
-      </w:r>
-      <w:proofErr w:type="spellEnd"/>
+        <w:t>, LaTex</w:t>
+      </w:r>
     </w:p>
     <w:sectPr>
       <w:footerReference w:type="default" r:id="rId11"/>

</xml_diff>